<commit_message>
Second-review revisions: figure numbering, format equivalence test, scope bounds
- corrected duplicate Fig. 7; main-text figures now number 1 to 10 in order, and
  the two case-study figures follow the text that discusses them
- TOST equivalence test on the Fab versus single-domain grammar comparison: it does
  NOT establish equivalence (p = 1.00, difference interval -0.30 to +0.08), so the
  claim is restated as underpowered rather than as agreement
- Section 3.10 bounded in the main text as interpretation on one antigen
- Introduction third clause made parallel
- Limitations now states that secondary structure is assigned per chain, so
  inter-chain beta bridges are missed and loop fractions are upper bounds
- removed a stale limitation claiming Section 3.7 uses residue-level statistics,
  which ceased to be true when those tests were moved to unit level

Co-Authored-By: Claude Opus 5 <noreply@anthropic.com>
</commit_message>
<xml_diff>
--- a/manuscript/MANUSCRIPT.docx
+++ b/manuscript/MANUSCRIPT.docx
@@ -186,7 +186,7 @@
           <w:i w:val="0"/>
           <w:sz w:val="22"/>
         </w:rPr>
-        <w:t>We addressed both difficulties directly. A single extraction pipeline was applied to antibody-antigen and general protein-protein complexes. All statistics were weighted over independence units defined by 30 percent sequence identity clustering of the bound protein. Every stratified comparison was benchmarked against a null drawn at the same sample size. We then asked three questions in sequence. First, what physical forces hold each interface class together. Second, whether the residue-pair preferences, which we refer to as the recognition grammar, are the same. Third, if they differ, whether the difference can be attributed to structural context, and if not, which chemistry is responsible.</w:t>
+        <w:t>We addressed both difficulties directly. A single extraction pipeline was applied to antibody-antigen and general protein-protein complexes. All statistics were weighted over independence units defined by 30 percent sequence identity clustering of the bound protein. Every stratified comparison was benchmarked against a null drawn at the same sample size. We then asked three questions in sequence. First, what physical forces hold each interface class together. Second, whether the residue-pair preferences, which we refer to as the recognition grammar, are the same. Third, if they differ, we ask whether the difference can be attributed to structural context, and where it cannot, which chemistry is responsible.</w:t>
       </w:r>
     </w:p>
     <w:p>
@@ -1154,7 +1154,7 @@
           <w:i w:val="0"/>
           <w:sz w:val="22"/>
         </w:rPr>
-        <w:t>Fold composition differs between the groups as expected, with 50 percent of antibody antigens in mainly-beta CATH classes against 22 percent of protein-protein partners. Matching on CATH class does not raise the correlation in any stratum. Resolution stratification, removal of the largest antigen clusters, leave-one-cluster-out resampling and variation of the hydrogen-bond distance criterion all leave the result intact. Finally, Fab and single-domain antibodies, which differ substantially in architecture, share one recognition grammar: their cross-format correlation of 0.18 falls inside the reliability ceiling of 0.25 with a range of 0.12 to 0.37 obtained by splitting the Fab corpus in half at the same sample size.</w:t>
+        <w:t>Fold composition differs between the groups as expected, with 50 percent of antibody antigens in mainly-beta CATH classes against 22 percent of protein-protein partners. Matching on CATH class does not raise the correlation in any stratum. Resolution stratification, removal of the largest antigen clusters, leave-one-cluster-out resampling and variation of the hydrogen-bond distance criterion all leave the result intact. Finally, Fab and single-domain antibodies differ substantially in architecture, and their cross-format grammar correlation of 0.18 falls inside the reliability ceiling of 0.25, with a range of 0.12 to 0.37, obtained by splitting the Fab corpus in half at the same sample size. That overlap is consistent with the two formats sharing one grammar, but it does not establish it. Holding this comparison to the same equivalence standard applied to the null results in Section 3.2, a two one-sided test against a margin of 0.085 does not reject non-equivalence, and the interval on the difference between the cross-format correlation and the within-format ceiling runs from -0.30 to +0.08. With 96 independence units on the single-domain side the comparison is underpowered, and it should be read as failing to detect a difference rather than as demonstrating equivalence.</w:t>
       </w:r>
     </w:p>
     <w:p>
@@ -1364,7 +1364,7 @@
         <w:rPr>
           <w:sz w:val="18"/>
         </w:rPr>
-        <w:t>Fig. 7 The same protein read by an antibody and by its natural partner, with both footprints painted onto one copy of the shared protein. (a) Angiogenin, among the higher-overlap pairs. (b) A low-overlap pair. Red marks residues contacted only by the antibody, blue only by the natural partner, and purple by both.</w:t>
+        <w:t>Fig. 6 The same protein read by an antibody and by its natural partner, with both footprints painted onto one copy of the shared protein. (a) Angiogenin, among the higher-overlap pairs. (b) A low-overlap pair. Red marks residues contacted only by the antibody, blue only by the natural partner, and purple by both.</w:t>
       </w:r>
     </w:p>
     <w:p>
@@ -1414,7 +1414,7 @@
         <w:rPr>
           <w:sz w:val="18"/>
         </w:rPr>
-        <w:t>Fig. 6 Interface composition, accessibility and protrusion scored against each protein's own accessible surface.</w:t>
+        <w:t>Fig. 7 Interface composition, accessibility and protrusion scored against each protein's own accessible surface.</w:t>
       </w:r>
     </w:p>
     <w:p>
@@ -1504,7 +1504,7 @@
         <w:rPr>
           <w:sz w:val="18"/>
         </w:rPr>
-        <w:t>Fig. 7 Principal component projection of interface descriptors, and the descriptors that most separate the two classes.</w:t>
+        <w:t>Fig. 8 Principal component projection of interface descriptors, and the descriptors that most separate the two classes.</w:t>
       </w:r>
     </w:p>
     <w:p>
@@ -1626,7 +1626,7 @@
           <w:i w:val="0"/>
           <w:sz w:val="22"/>
         </w:rPr>
-        <w:t>The two observations are compatible, and their reconciliation is the point of this section. Convergence does not require that the targeted patch be chemically special. A contiguous, accessible, conformationally coherent face is sufficient, because that is what a set of hypervariable loops can engage. Selection acts on the antibody, which must present a complementary surface, not on the antigen, which need only be exposed. Immunodominance is therefore better read as a constraint of the paratope than as a property of the epitope, which is consistent with every asymmetry reported above.</w:t>
+        <w:t>The two observations are compatible, and their reconciliation is the point of this section. It rests on one antigen and 42 structures that the weighting scheme treats as a single independence unit everywhere else, so what follows is an interpretation consistent with the corpus-wide results rather than an independent test of them, and it should not be generalised to antigens with different surface topography. Convergence does not require that the targeted patch be chemically special. A contiguous, accessible, conformationally coherent face is sufficient, because that is what a set of hypervariable loops can engage. Selection acts on the antibody, which must present a complementary surface, not on the antigen, which need only be exposed. Immunodominance is therefore better read as a constraint of the paratope than as a property of the epitope, which is consistent with every asymmetry reported above.</w:t>
       </w:r>
     </w:p>
     <w:p>
@@ -1645,6 +1645,56 @@
     </w:p>
     <w:p>
       <w:pPr>
+        <w:jc w:val="center"/>
+      </w:pPr>
+      <w:r>
+        <w:drawing>
+          <wp:inline xmlns:a="http://schemas.openxmlformats.org/drawingml/2006/main" xmlns:pic="http://schemas.openxmlformats.org/drawingml/2006/picture">
+            <wp:extent cx="5669280" cy="2980812"/>
+            <wp:docPr id="9" name="Picture 9"/>
+            <wp:cNvGraphicFramePr>
+              <a:graphicFrameLocks noChangeAspect="1"/>
+            </wp:cNvGraphicFramePr>
+            <a:graphic>
+              <a:graphicData uri="http://schemas.openxmlformats.org/drawingml/2006/picture">
+                <pic:pic>
+                  <pic:nvPicPr>
+                    <pic:cNvPr id="0" name="pymol_immunodominance_montage.png"/>
+                    <pic:cNvPicPr/>
+                  </pic:nvPicPr>
+                  <pic:blipFill>
+                    <a:blip r:embed="rId17"/>
+                    <a:stretch>
+                      <a:fillRect/>
+                    </a:stretch>
+                  </pic:blipFill>
+                  <pic:spPr>
+                    <a:xfrm>
+                      <a:off x="0" y="0"/>
+                      <a:ext cx="5669280" cy="2980812"/>
+                    </a:xfrm>
+                    <a:prstGeom prst="rect"/>
+                  </pic:spPr>
+                </pic:pic>
+              </a:graphicData>
+            </a:graphic>
+          </wp:inline>
+        </w:drawing>
+      </w:r>
+    </w:p>
+    <w:p>
+      <w:pPr>
+        <w:spacing w:after="240"/>
+      </w:pPr>
+      <w:r>
+        <w:rPr>
+          <w:sz w:val="18"/>
+        </w:rPr>
+        <w:t>Fig. 9 Contact frequency of 42 independently raised antibodies mapped onto the lysozyme surface. Catalytic residues are shown as sticks.</w:t>
+      </w:r>
+    </w:p>
+    <w:p>
+      <w:pPr>
         <w:spacing w:after="120"/>
         <w:jc w:val="both"/>
       </w:pPr>
@@ -1665,7 +1715,7 @@
         <w:drawing>
           <wp:inline xmlns:a="http://schemas.openxmlformats.org/drawingml/2006/main" xmlns:pic="http://schemas.openxmlformats.org/drawingml/2006/picture">
             <wp:extent cx="5669280" cy="1716004"/>
-            <wp:docPr id="9" name="Picture 9"/>
+            <wp:docPr id="10" name="Picture 10"/>
             <wp:cNvGraphicFramePr>
               <a:graphicFrameLocks noChangeAspect="1"/>
             </wp:cNvGraphicFramePr>
@@ -1677,7 +1727,7 @@
                     <pic:cNvPicPr/>
                   </pic:nvPicPr>
                   <pic:blipFill>
-                    <a:blip r:embed="rId17"/>
+                    <a:blip r:embed="rId18"/>
                     <a:stretch>
                       <a:fillRect/>
                     </a:stretch>
@@ -1704,57 +1754,7 @@
         <w:rPr>
           <w:sz w:val="18"/>
         </w:rPr>
-        <w:t>Fig. 9 Thermodynamic signature across 42 independent antibodies against one antigen. (a) Heat-capacity change per unit buried surface for the lysozyme series against all antibody interfaces. (b) The same quantity against the number of immunodominant positions contacted. (c) Apolar fraction of buried surface against total buried surface.</w:t>
-      </w:r>
-    </w:p>
-    <w:p>
-      <w:pPr>
-        <w:jc w:val="center"/>
-      </w:pPr>
-      <w:r>
-        <w:drawing>
-          <wp:inline xmlns:a="http://schemas.openxmlformats.org/drawingml/2006/main" xmlns:pic="http://schemas.openxmlformats.org/drawingml/2006/picture">
-            <wp:extent cx="5669280" cy="2980812"/>
-            <wp:docPr id="10" name="Picture 10"/>
-            <wp:cNvGraphicFramePr>
-              <a:graphicFrameLocks noChangeAspect="1"/>
-            </wp:cNvGraphicFramePr>
-            <a:graphic>
-              <a:graphicData uri="http://schemas.openxmlformats.org/drawingml/2006/picture">
-                <pic:pic>
-                  <pic:nvPicPr>
-                    <pic:cNvPr id="0" name="pymol_immunodominance_montage.png"/>
-                    <pic:cNvPicPr/>
-                  </pic:nvPicPr>
-                  <pic:blipFill>
-                    <a:blip r:embed="rId18"/>
-                    <a:stretch>
-                      <a:fillRect/>
-                    </a:stretch>
-                  </pic:blipFill>
-                  <pic:spPr>
-                    <a:xfrm>
-                      <a:off x="0" y="0"/>
-                      <a:ext cx="5669280" cy="2980812"/>
-                    </a:xfrm>
-                    <a:prstGeom prst="rect"/>
-                  </pic:spPr>
-                </pic:pic>
-              </a:graphicData>
-            </a:graphic>
-          </wp:inline>
-        </w:drawing>
-      </w:r>
-    </w:p>
-    <w:p>
-      <w:pPr>
-        <w:spacing w:after="240"/>
-      </w:pPr>
-      <w:r>
-        <w:rPr>
-          <w:sz w:val="18"/>
-        </w:rPr>
-        <w:t>Fig. 8 Contact frequency of 42 independently raised antibodies mapped onto the lysozyme surface. Catalytic residues are shown as sticks.</w:t>
+        <w:t>Fig. 10 Thermodynamic signature across 42 independent antibodies against one antigen. (a) Heat-capacity change per unit buried surface for the lysozyme series against all antibody interfaces. (b) The same quantity against the number of immunodominant positions contacted. (c) Apolar fraction of buried surface against total buried surface.</w:t>
       </w:r>
     </w:p>
     <w:p>
@@ -1820,7 +1820,7 @@
           <w:i w:val="0"/>
           <w:sz w:val="22"/>
         </w:rPr>
-        <w:t>The antibody corpus consists entirely of X-ray structures and therefore excludes the cryo-electron microscopy literature, which is where most large viral glycoprotein complexes are found. Structural analyses on the protein-protein group used a random sample of 1,000 of the 2,292 complexes, which is reported rather than implied. Shape complementarity was computed on an approximation to the molecular surface that omits re-entrant regions, so its absolute values are not comparable with published figures although the between-group comparison is internally valid. CATH assignments cover 43 percent of antibody antigens against 80 percent of protein-protein partners, so the fold-matched control is weaker than the secondary-structure control. Per-residue evolutionary conservation could not be computed corpus-wide in this environment and is reported only for the lysozyme case study. Interface-versus-surface comparisons in Section 3.7 were computed at residue level rather than unit level, so their effect sizes should be read in preference to their p values. Finally, rigorous Poisson-Boltzmann electrostatics, molecular dynamics and docking were outside the scope of the analysis environment.</w:t>
+        <w:t>The antibody corpus consists entirely of X-ray structures and therefore excludes the cryo-electron microscopy literature, which is where most large viral glycoprotein complexes are found. Structural analyses on the protein-protein group used a random sample of 1,000 of the 2,292 complexes, which is reported rather than implied. Shape complementarity was computed on an approximation to the molecular surface that omits re-entrant regions, so its absolute values are not comparable with published figures although the between-group comparison is internally valid. CATH assignments cover 43 percent of antibody antigens against 80 percent of protein-protein partners, so the fold-matched control is weaker than the secondary-structure control. The secondary-structure implementation operates on one chain at a time, so beta bridges formed between chains are not detected and their residues are assigned as loop. This inflates loop content and deflates strand content in both groups. Because the same procedure is applied to each, the comparative claims are unaffected, but the absolute loop fractions in Section 3.6 should be read as upper bounds, and no DSSP executable was available for a direct cross-check. Per-residue evolutionary conservation could not be computed corpus-wide in this environment and is reported only for the lysozyme case study. Interface-versus-surface comparisons in Section 3.7 are computed on unit-level medians, paired within independence unit. Finally, rigorous Poisson-Boltzmann electrostatics, molecular dynamics and docking were outside the scope of the analysis environment.</w:t>
       </w:r>
     </w:p>
     <w:p>

</xml_diff>

<commit_message>
Independent cross-validation of the secondary-structure implementation
Installed pydssp 0.9.1 into an isolated environment and loaded its numpy backend
directly by file path, bypassing the package __init__ whose torch import is the
only reason the package appears to require PyTorch.

Result: 98.25 percent three-state agreement, Cohen kappa 0.973, over 432 chains and
79,977 residues, with no failures. This resolves the reviewer request for validation
against an established program and shows the earlier 88.9 percent figure against
deposited HELIX and SHEET records was bounded by that reference rather than by the
implementation.

Scope stated in both Methods and Limitations: pydssp also assigns from a single
ordered backbone array, so it shares the per-chain constraint and the agreement
establishes algorithmic fidelity without bounding the inter-chain beta-bridge gap.
A full DSSP executable would be required for that.

Co-Authored-By: Claude Opus 5 <noreply@anthropic.com>
</commit_message>
<xml_diff>
--- a/manuscript/MANUSCRIPT.docx
+++ b/manuscript/MANUSCRIPT.docx
@@ -320,7 +320,7 @@
           <w:i w:val="0"/>
           <w:sz w:val="22"/>
         </w:rPr>
-        <w:t>The third layer is per-residue structural context. Because this pass requires repeated solvent-accessibility calculation it was run over 1,512 complexes rather than the full corpus: all 512 antibody complexes, and a seeded random sample of 1,000 of the 2,292 protein-protein complexes, which still exceeds the antibody arm in both structures and independence units. Every analysis that depends on secondary structure, torsion angles or buried surface therefore uses this subsample on the protein-protein side, while the contact and atom-level analyses use the complete corpus. The pass yielded 1,019,571 annotated residues. Secondary structure was assigned by the Kabsch and Sander algorithm, implemented directly for this study because no DSSP executable was available in the analysis environment. The implementation places the amide hydrogen along the direction opposite the preceding carbonyl, computes the electrostatic hydrogen-bond energy with the standard coefficient, applies a threshold of -0.5 kcal per mol, and derives turns, bridges and ladders from the resulting hydrogen-bond map. Because an implementation of this kind should not be trusted without evidence, it was validated against the HELIX and SHEET records deposited with each structure, giving 88.9 percent three-state agreement across 622,662 residues. This figure is lower than the agreement typically quoted between independent secondary-structure programs, which exceeds 95 percent, and the discrepancy requires comment. Deposited HELIX and SHEET records are author annotations rather than a geometric derivation, they are known to differ from algorithmic assignment particularly at element termini and for short or distorted elements, and they provide no loop category against which agreement can be scored. Our figure is therefore agreement with a coarser reference, not with DSSP itself, and should be read as a lower bound. All secondary-structure claims in this work are three-state and comparative, applied identically to both groups, so a uniform assignment error would affect both arms equally and cannot generate a difference between them. Backbone torsions phi and psi and side-chain torsions chi1 and chi2 were computed from coordinates, with the dihedral routine asserted against an independent reference implementation before use. Solvent-accessible surface area was computed by the Shrake-Rupley algorithm in the complex and in isolation, giving the surface buried on association for each residue and, in a separate pass resolved to atoms, separately for apolar and polar atoms.</w:t>
+        <w:t>The third layer is per-residue structural context. Because this pass requires repeated solvent-accessibility calculation it was run over 1,512 complexes rather than the full corpus: all 512 antibody complexes, and a seeded random sample of 1,000 of the 2,292 protein-protein complexes, which still exceeds the antibody arm in both structures and independence units. Every analysis that depends on secondary structure, torsion angles or buried surface therefore uses this subsample on the protein-protein side, while the contact and atom-level analyses use the complete corpus. The pass yielded 1,019,571 annotated residues. Secondary structure was assigned by the Kabsch and Sander algorithm, implemented directly for this study because no DSSP executable was available in the analysis environment. The implementation places the amide hydrogen along the direction opposite the preceding carbonyl, computes the electrostatic hydrogen-bond energy with the standard coefficient, applies a threshold of -0.5 kcal per mol, and derives turns, bridges and ladders from the resulting hydrogen-bond map. Because an implementation of this kind should not be trusted without evidence, it was validated against the HELIX and SHEET records deposited with each structure, giving 88.9 percent three-state agreement across 622,662 residues. The implementation was additionally cross-checked against pydssp, an independent numpy implementation of the same algorithm, over 432 chains and 79,977 residues drawn from both corpora. Three-state agreement was 98.25 percent with a Cohen kappa of 0.973 and no failures. The two figures answer different questions. Agreement with an independent implementation establishes that the algorithm is implemented faithfully. Agreement with deposited records is bounded by the records themselves, so the lower figure is a property of that reference rather than of the code. That figure is lower than the agreement typically quoted between independent secondary-structure programs, which exceeds 95 percent, and the discrepancy requires comment. Deposited HELIX and SHEET records are author annotations rather than a geometric derivation, they are known to differ from algorithmic assignment particularly at element termini and for short or distorted elements, and they provide no loop category against which agreement can be scored. Our figure is therefore agreement with a coarser reference, not with DSSP itself, and should be read as a lower bound. All secondary-structure claims in this work are three-state and comparative, applied identically to both groups, so a uniform assignment error would affect both arms equally and cannot generate a difference between them. Backbone torsions phi and psi and side-chain torsions chi1 and chi2 were computed from coordinates, with the dihedral routine asserted against an independent reference implementation before use. Solvent-accessible surface area was computed by the Shrake-Rupley algorithm in the complex and in isolation, giving the surface buried on association for each residue and, in a separate pass resolved to atoms, separately for apolar and polar atoms.</w:t>
       </w:r>
     </w:p>
     <w:p>
@@ -1820,7 +1820,7 @@
           <w:i w:val="0"/>
           <w:sz w:val="22"/>
         </w:rPr>
-        <w:t>The antibody corpus consists entirely of X-ray structures and therefore excludes the cryo-electron microscopy literature, which is where most large viral glycoprotein complexes are found. Structural analyses on the protein-protein group used a random sample of 1,000 of the 2,292 complexes, which is reported rather than implied. Shape complementarity was computed on an approximation to the molecular surface that omits re-entrant regions, so its absolute values are not comparable with published figures although the between-group comparison is internally valid. CATH assignments cover 43 percent of antibody antigens against 80 percent of protein-protein partners, so the fold-matched control is weaker than the secondary-structure control. The secondary-structure implementation operates on one chain at a time, so beta bridges formed between chains are not detected and their residues are assigned as loop. This inflates loop content and deflates strand content in both groups. Because the same procedure is applied to each, the comparative claims are unaffected, but the absolute loop fractions in Section 3.6 should be read as upper bounds, and no DSSP executable was available for a direct cross-check. Per-residue evolutionary conservation could not be computed corpus-wide in this environment and is reported only for the lysozyme case study. Interface-versus-surface comparisons in Section 3.7 are computed on unit-level medians, paired within independence unit. Finally, rigorous Poisson-Boltzmann electrostatics, molecular dynamics and docking were outside the scope of the analysis environment.</w:t>
+        <w:t>The antibody corpus consists entirely of X-ray structures and therefore excludes the cryo-electron microscopy literature, which is where most large viral glycoprotein complexes are found. Structural analyses on the protein-protein group used a random sample of 1,000 of the 2,292 complexes, which is reported rather than implied. Shape complementarity was computed on an approximation to the molecular surface that omits re-entrant regions, so its absolute values are not comparable with published figures although the between-group comparison is internally valid. CATH assignments cover 43 percent of antibody antigens against 80 percent of protein-protein partners, so the fold-matched control is weaker than the secondary-structure control. The secondary-structure implementation operates on one chain at a time, so beta bridges formed between chains are not detected and their residues are assigned as loop. This inflates loop content and deflates strand content in both groups. Because the same procedure is applied to each, the comparative claims are unaffected, but the absolute loop fractions in Section 3.6 should be read as upper bounds. The independent implementation used for cross-validation in Section 2.2 assigns from a single ordered backbone array and so shares this constraint, meaning the 98.25 percent agreement reported there establishes fidelity to the algorithm but does not bound the inter-chain gap. Resolving it would require a full DSSP executable, which processes the complete structure. Per-residue evolutionary conservation could not be computed corpus-wide in this environment and is reported only for the lysozyme case study. Interface-versus-surface comparisons in Section 3.7 are computed on unit-level medians, paired within independence unit. Finally, rigorous Poisson-Boltzmann electrostatics, molecular dynamics and docking were outside the scope of the analysis environment.</w:t>
       </w:r>
     </w:p>
     <w:p>

</xml_diff>